<commit_message>
fix: quitar nota interna de la plantilla de carta de adeudo por defecto
La plantilla de Word que se usa cuando un condominio no tiene su propia
plantilla cargada (como La Virgen) traía escrito de forma fija un párrafo
"Nota: ... enviados por Whatssap hasta el 12 de julio 2026" con una fecha
vieja hardcodeada. Se quita ese párrafo de la plantilla; el resto de la
carta (tabla de adeudo, cierre, firma) queda igual.

Co-Authored-By: Claude Sonnet 5 <noreply@anthropic.com>
</commit_message>
<xml_diff>
--- a/resources/docx/billing/carta-adeudo.docx
+++ b/resources/docx/billing/carta-adeudo.docx
@@ -353,98 +353,6 @@
           <w:szCs w:val="24"/>
         </w:rPr>
         <w:t xml:space="preserve"> de julio del presente año para indicárselo al administrador. </w:t>
-      </w:r>
-    </w:p>
-    <w:p>
-      <w:pPr>
-        <w:jc w:val="both"/>
-        <w:rPr>
-          <w:rFonts w:ascii="Arial" w:hAnsi="Arial" w:cs="Arial"/>
-          <w:sz w:val="24"/>
-          <w:szCs w:val="24"/>
-        </w:rPr>
-      </w:pPr>
-      <w:r>
-        <w:rPr>
-          <w:rFonts w:ascii="Arial" w:hAnsi="Arial" w:cs="Arial"/>
-          <w:sz w:val="24"/>
-          <w:szCs w:val="24"/>
-        </w:rPr>
-        <w:t>Nota: Para la ela</w:t>
-      </w:r>
-      <w:r>
-        <w:rPr>
-          <w:rFonts w:ascii="Arial" w:hAnsi="Arial" w:cs="Arial"/>
-          <w:sz w:val="24"/>
-          <w:szCs w:val="24"/>
-        </w:rPr>
-        <w:t>boración del presente documento</w:t>
-      </w:r>
-      <w:r>
-        <w:rPr>
-          <w:rFonts w:ascii="Arial" w:hAnsi="Arial" w:cs="Arial"/>
-          <w:sz w:val="24"/>
-          <w:szCs w:val="24"/>
-        </w:rPr>
-        <w:t xml:space="preserve"> se consideraron los estado</w:t>
-      </w:r>
-      <w:r>
-        <w:rPr>
-          <w:rFonts w:ascii="Arial" w:hAnsi="Arial" w:cs="Arial"/>
-          <w:sz w:val="24"/>
-          <w:szCs w:val="24"/>
-        </w:rPr>
-        <w:t>s de cuenta</w:t>
-      </w:r>
-      <w:r>
-        <w:rPr>
-          <w:rFonts w:ascii="Arial" w:hAnsi="Arial" w:cs="Arial"/>
-          <w:sz w:val="24"/>
-          <w:szCs w:val="24"/>
-        </w:rPr>
-        <w:t xml:space="preserve">, los pagos entregados físicamente y/o enviados por </w:t>
-      </w:r>
-      <w:proofErr w:type="spellStart"/>
-      <w:r>
-        <w:rPr>
-          <w:rFonts w:ascii="Arial" w:hAnsi="Arial" w:cs="Arial"/>
-          <w:sz w:val="24"/>
-          <w:szCs w:val="24"/>
-        </w:rPr>
-        <w:t>Wh</w:t>
-      </w:r>
-      <w:r>
-        <w:rPr>
-          <w:rFonts w:ascii="Arial" w:hAnsi="Arial" w:cs="Arial"/>
-          <w:sz w:val="24"/>
-          <w:szCs w:val="24"/>
-        </w:rPr>
-        <w:t>atssap</w:t>
-      </w:r>
-      <w:proofErr w:type="spellEnd"/>
-      <w:r>
-        <w:rPr>
-          <w:rFonts w:ascii="Arial" w:hAnsi="Arial" w:cs="Arial"/>
-          <w:sz w:val="24"/>
-          <w:szCs w:val="24"/>
-        </w:rPr>
-        <w:t xml:space="preserve"> </w:t>
-      </w:r>
-      <w:r>
-        <w:rPr>
-          <w:rFonts w:ascii="Arial" w:hAnsi="Arial" w:cs="Arial"/>
-          <w:sz w:val="24"/>
-          <w:szCs w:val="24"/>
-        </w:rPr>
-        <w:t>hasta el 12 de julio 2026</w:t>
-      </w:r>
-      <w:r>
-        <w:rPr>
-          <w:rFonts w:ascii="Arial" w:hAnsi="Arial" w:cs="Arial"/>
-          <w:sz w:val="24"/>
-          <w:szCs w:val="24"/>
-        </w:rPr>
-        <w:t xml:space="preserve"> </w:t>
       </w:r>
     </w:p>
     <w:p>

</xml_diff>

<commit_message>
fix: usar el mismo texto de cierre en la plantilla de carta por defecto
La plantilla por defecto (la que usa La Virgen y cualquier condominio sin
plantilla propia) cerraba con "En caso de tener alguna duda... 31 de
julio...". Se reemplaza por el mismo texto que ya usa Real de Boleo II:
"El corte es contemplando la cuota que debe de tener pagada hasta el mes
corriente, en caso de tener alguna duda favor de comunicarse a la
administración.", para que todos los condominios muestren el mismo cierre
abajo de la tabla de adeudo.

Co-Authored-By: Claude Sonnet 5 <noreply@anthropic.com>
</commit_message>
<xml_diff>
--- a/resources/docx/billing/carta-adeudo.docx
+++ b/resources/docx/billing/carta-adeudo.docx
@@ -336,23 +336,7 @@
           <w:sz w:val="24"/>
           <w:szCs w:val="24"/>
         </w:rPr>
-        <w:t>En caso de tener alguna duda, comentario y</w:t>
-      </w:r>
-      <w:r>
-        <w:rPr>
-          <w:rFonts w:ascii="Arial" w:hAnsi="Arial" w:cs="Arial"/>
-          <w:sz w:val="24"/>
-          <w:szCs w:val="24"/>
-        </w:rPr>
-        <w:t>/o aclaración, tiene hasta el 31</w:t>
-      </w:r>
-      <w:r>
-        <w:rPr>
-          <w:rFonts w:ascii="Arial" w:hAnsi="Arial" w:cs="Arial"/>
-          <w:sz w:val="24"/>
-          <w:szCs w:val="24"/>
-        </w:rPr>
-        <w:t xml:space="preserve"> de julio del presente año para indicárselo al administrador. </w:t>
+        <w:t xml:space="preserve">El corte es contemplando la cuota que debe de tener pagada hasta el mes corriente, en caso de tener alguna duda favor de comunicarse a la administración. </w:t>
       </w:r>
     </w:p>
     <w:p>

</xml_diff>